<commit_message>
Add Lorenzen M section to the diagnostics memo
At identical parameter count Lorenzen fits better than constant M on both
data components (total 1567.8 vs 1646.4). There is no parsimony argument
for constant M; it is simply the worse of the two. Provisional pending
the multi-start.

Co-Authored-By: Claude Opus 5 (1M context) <noreply@anthropic.com>
</commit_message>
<xml_diff>
--- a/review/diagnostics-memo.docx
+++ b/review/diagnostics-memo.docx
@@ -2,7 +2,7 @@
 <file path=word/document.xml><?xml version="1.0" encoding="utf-8"?>
 <w:document xmlns:w="http://schemas.openxmlformats.org/wordprocessingml/2006/main" xmlns:m="http://schemas.openxmlformats.org/officeDocument/2006/math" xmlns:r="http://schemas.openxmlformats.org/officeDocument/2006/relationships" xmlns:o="urn:schemas-microsoft-com:office:office" xmlns:v="urn:schemas-microsoft-com:vml" xmlns:w10="urn:schemas-microsoft-com:office:word" xmlns:a="http://schemas.openxmlformats.org/drawingml/2006/main" xmlns:pic="http://schemas.openxmlformats.org/drawingml/2006/picture" xmlns:wp="http://schemas.openxmlformats.org/drawingml/2006/wordprocessingDrawing">
   <w:body>
-    <w:bookmarkStart w:id="16" w:name="section-10-diagnostics-first-results"/>
+    <w:bookmarkStart w:id="17" w:name="section-10-diagnostics-first-results"/>
     <w:p>
       <w:pPr>
         <w:pStyle w:val="Heading1"/>
@@ -80,7 +80,7 @@
         <w:t xml:space="preserve"> </w:t>
       </w:r>
       <w:r>
-        <w:t xml:space="preserve">first three diagnostics, and a methodological problem that conditions</w:t>
+        <w:t xml:space="preserve">first four diagnostics, and a methodological problem that conditions</w:t>
       </w:r>
       <w:r>
         <w:t xml:space="preserve"> </w:t>
@@ -110,25 +110,31 @@
         <w:pStyle w:val="FirstParagraph"/>
       </w:pPr>
       <w:r>
-        <w:t xml:space="preserve">Three of your seven S.10 diagnostics are run. Before any of them: this</w:t>
-      </w:r>
-      <w:r>
-        <w:t xml:space="preserve"> </w:t>
-      </w:r>
-      <w:r>
-        <w:t xml:space="preserve">likelihood surface is strongly multi-modal, and single-start fits of</w:t>
-      </w:r>
-      <w:r>
-        <w:t xml:space="preserve"> </w:t>
-      </w:r>
-      <w:r>
-        <w:t xml:space="preserve">perturbed configurations are not trustworthy. Everything below is the</w:t>
-      </w:r>
-      <w:r>
-        <w:t xml:space="preserve"> </w:t>
-      </w:r>
-      <w:r>
-        <w:t xml:space="preserve">best of 21 starts.</w:t>
+        <w:t xml:space="preserve">Four of your seven S.10 diagnostics are run. Before any of them: this</w:t>
+      </w:r>
+      <w:r>
+        <w:t xml:space="preserve"> </w:t>
+      </w:r>
+      <w:r>
+        <w:t xml:space="preserve">likelihood surface is strongly multi-modal, single-start fits of</w:t>
+      </w:r>
+      <w:r>
+        <w:t xml:space="preserve"> </w:t>
+      </w:r>
+      <w:r>
+        <w:t xml:space="preserve">perturbed configurations are not trustworthy, and the source of the</w:t>
+      </w:r>
+      <w:r>
+        <w:t xml:space="preserve"> </w:t>
+      </w:r>
+      <w:r>
+        <w:t xml:space="preserve">problem turns out to be the sex-specific selectivity structure you</w:t>
+      </w:r>
+      <w:r>
+        <w:t xml:space="preserve"> </w:t>
+      </w:r>
+      <w:r>
+        <w:t xml:space="preserve">flagged in S.5. Everything below is best-of-N.</w:t>
       </w:r>
     </w:p>
     <w:p>
@@ -136,46 +142,31 @@
         <w:pStyle w:val="BodyText"/>
       </w:pPr>
       <w:r>
-        <w:t xml:space="preserve">The headline result is that</w:t>
-      </w:r>
-      <w:r>
-        <w:t xml:space="preserve"> </w:t>
-      </w:r>
+        <w:t xml:space="preserve">Two substantive results.</w:t>
+      </w:r>
+    </w:p>
+    <w:p>
+      <w:pPr>
+        <w:pStyle w:val="BodyText"/>
+      </w:pPr>
       <w:r>
         <w:rPr>
           <w:b/>
           <w:bCs/>
         </w:rPr>
-        <w:t xml:space="preserve">A0’s depletion estimate is not robust to</w:t>
-      </w:r>
-      <w:r>
-        <w:rPr>
-          <w:b/>
-          <w:bCs/>
-        </w:rPr>
-        <w:t xml:space="preserve"> </w:t>
-      </w:r>
-      <w:r>
-        <w:rPr>
-          <w:b/>
-          <w:bCs/>
-        </w:rPr>
-        <w:t xml:space="preserve">allowing recruitment variation</w:t>
-      </w:r>
-      <w:r>
-        <w:t xml:space="preserve">. Estimated 2023 depletion moves from</w:t>
-      </w:r>
-      <w:r>
-        <w:t xml:space="preserve"> </w:t>
-      </w:r>
-      <w:r>
-        <w:t xml:space="preserve">0.086 to 0.185 when recruitment deviations are switched on, and the fit</w:t>
-      </w:r>
-      <w:r>
-        <w:t xml:space="preserve"> </w:t>
-      </w:r>
-      <w:r>
-        <w:t xml:space="preserve">to</w:t>
+        <w:t xml:space="preserve">A0’s depletion is not robust to relaxing its deterministic structure.</w:t>
+      </w:r>
+      <w:r>
+        <w:t xml:space="preserve"> </w:t>
+      </w:r>
+      <w:r>
+        <w:t xml:space="preserve">Estimated 2023 depletion moves from 0.086 to 0.185 when recruitment</w:t>
+      </w:r>
+      <w:r>
+        <w:t xml:space="preserve"> </w:t>
+      </w:r>
+      <w:r>
+        <w:t xml:space="preserve">deviations are switched on, and the fit to</w:t>
       </w:r>
       <w:r>
         <w:t xml:space="preserve"> </w:t>
@@ -191,25 +182,83 @@
         <w:t xml:space="preserve"> </w:t>
       </w:r>
       <w:r>
-        <w:t xml:space="preserve">data components improves substantially. That is close to what</w:t>
-      </w:r>
-      <w:r>
-        <w:t xml:space="preserve"> </w:t>
-      </w:r>
-      <w:r>
-        <w:t xml:space="preserve">your B-series counterparts produce by a different route (B1 0.172, B4</w:t>
-      </w:r>
-      <w:r>
-        <w:t xml:space="preserve"> </w:t>
-      </w:r>
-      <w:r>
-        <w:t xml:space="preserve">0.179), so two independent relaxations of A0’s deterministic structure</w:t>
-      </w:r>
-      <w:r>
-        <w:t xml:space="preserve"> </w:t>
-      </w:r>
-      <w:r>
-        <w:t xml:space="preserve">land in the same place.</w:t>
+        <w:t xml:space="preserve">data components</w:t>
+      </w:r>
+      <w:r>
+        <w:t xml:space="preserve"> </w:t>
+      </w:r>
+      <w:r>
+        <w:t xml:space="preserve">improves. Your B-series counterparts reach 0.172 and 0.179 by relaxing</w:t>
+      </w:r>
+      <w:r>
+        <w:t xml:space="preserve"> </w:t>
+      </w:r>
+      <w:r>
+        <w:t xml:space="preserve">constant M instead. Three independent relaxations land near twice the</w:t>
+      </w:r>
+      <w:r>
+        <w:t xml:space="preserve"> </w:t>
+      </w:r>
+      <w:r>
+        <w:t xml:space="preserve">base depletion.</w:t>
+      </w:r>
+    </w:p>
+    <w:p>
+      <w:pPr>
+        <w:pStyle w:val="BodyText"/>
+      </w:pPr>
+      <w:r>
+        <w:rPr>
+          <w:b/>
+          <w:bCs/>
+        </w:rPr>
+        <w:t xml:space="preserve">Constant M is a worse-fitting assumption than a standard alternative</w:t>
+      </w:r>
+      <w:r>
+        <w:rPr>
+          <w:b/>
+          <w:bCs/>
+        </w:rPr>
+        <w:t xml:space="preserve"> </w:t>
+      </w:r>
+      <w:r>
+        <w:rPr>
+          <w:b/>
+          <w:bCs/>
+        </w:rPr>
+        <w:t xml:space="preserve">at identical cost.</w:t>
+      </w:r>
+      <w:r>
+        <w:t xml:space="preserve"> </w:t>
+      </w:r>
+      <w:r>
+        <w:t xml:space="preserve">Lorenzen M, with the same 46 estimated parameters,</w:t>
+      </w:r>
+      <w:r>
+        <w:t xml:space="preserve"> </w:t>
+      </w:r>
+      <w:r>
+        <w:t xml:space="preserve">fits better on both data components than A0 does.</w:t>
+      </w:r>
+    </w:p>
+    <w:p>
+      <w:pPr>
+        <w:pStyle w:val="BodyText"/>
+      </w:pPr>
+      <w:r>
+        <w:t xml:space="preserve">Neither disturbs the low-abundance conclusion, which is robust across</w:t>
+      </w:r>
+      <w:r>
+        <w:t xml:space="preserve"> </w:t>
+      </w:r>
+      <w:r>
+        <w:t xml:space="preserve">everything we have run. What moves is the reconstructed unfished scale,</w:t>
+      </w:r>
+      <w:r>
+        <w:t xml:space="preserve"> </w:t>
+      </w:r>
+      <w:r>
+        <w:t xml:space="preserve">and therefore the removal advice.</w:t>
       </w:r>
     </w:p>
     <w:bookmarkEnd w:id="9"/>
@@ -2381,13 +2430,13 @@
       </w:r>
     </w:p>
     <w:bookmarkEnd w:id="13"/>
-    <w:bookmarkStart w:id="14" w:name="what-this-adds-up-to"/>
+    <w:bookmarkStart w:id="14" w:name="mortality-structure-s.10-row-3"/>
     <w:p>
       <w:pPr>
         <w:pStyle w:val="Heading2"/>
       </w:pPr>
       <w:r>
-        <w:t xml:space="preserve">What this adds up to</w:t>
+        <w:t xml:space="preserve">4. Mortality structure (S.10 row 3)</w:t>
       </w:r>
     </w:p>
     <w:p>
@@ -2395,37 +2444,357 @@
         <w:pStyle w:val="FirstParagraph"/>
       </w:pPr>
       <w:r>
-        <w:t xml:space="preserve">A0’s depletion of about 0.09 is conditional on two structural</w:t>
-      </w:r>
-      <w:r>
-        <w:t xml:space="preserve"> </w:t>
-      </w:r>
-      <w:r>
-        <w:t xml:space="preserve">assumptions that the data do not obviously support. Allowing recruitment</w:t>
-      </w:r>
-      <w:r>
-        <w:t xml:space="preserve"> </w:t>
-      </w:r>
-      <w:r>
-        <w:t xml:space="preserve">variation moves it to 0.185. Your B-series counterparts, which relax</w:t>
-      </w:r>
-      <w:r>
-        <w:t xml:space="preserve"> </w:t>
-      </w:r>
-      <w:r>
-        <w:t xml:space="preserve">constant natural mortality instead, reach 0.172 and 0.179. Three</w:t>
-      </w:r>
-      <w:r>
-        <w:t xml:space="preserve"> </w:t>
-      </w:r>
-      <w:r>
-        <w:t xml:space="preserve">different relaxations of A0’s deterministic structure converge on</w:t>
-      </w:r>
-      <w:r>
-        <w:t xml:space="preserve"> </w:t>
-      </w:r>
-      <w:r>
-        <w:t xml:space="preserve">roughly twice the base depletion.</w:t>
+        <w:rPr>
+          <w:rStyle w:val="VerbatimChar"/>
+        </w:rPr>
+        <w:t xml:space="preserve">D4_lorenzenM</w:t>
+      </w:r>
+      <w:r>
+        <w:t xml:space="preserve"> </w:t>
+      </w:r>
+      <w:r>
+        <w:t xml:space="preserve">switches</w:t>
+      </w:r>
+      <w:r>
+        <w:t xml:space="preserve"> </w:t>
+      </w:r>
+      <w:r>
+        <w:rPr>
+          <w:rStyle w:val="VerbatimChar"/>
+        </w:rPr>
+        <w:t xml:space="preserve">natM_type</w:t>
+      </w:r>
+      <w:r>
+        <w:t xml:space="preserve"> </w:t>
+      </w:r>
+      <w:r>
+        <w:t xml:space="preserve">from 0 to 2 with a reference age of</w:t>
+      </w:r>
+      <w:r>
+        <w:t xml:space="preserve"> </w:t>
+      </w:r>
+      <w:r>
+        <w:t xml:space="preserve">40, matching</w:t>
+      </w:r>
+      <w:r>
+        <w:t xml:space="preserve"> </w:t>
+      </w:r>
+      <w:r>
+        <w:rPr>
+          <w:rStyle w:val="VerbatimChar"/>
+        </w:rPr>
+        <w:t xml:space="preserve">Growth_Age_for_L2</w:t>
+      </w:r>
+      <w:r>
+        <w:t xml:space="preserve">. The supplied fixed M of 0.065 becomes M</w:t>
+      </w:r>
+      <w:r>
+        <w:t xml:space="preserve"> </w:t>
+      </w:r>
+      <w:r>
+        <w:rPr>
+          <w:i/>
+          <w:iCs/>
+        </w:rPr>
+        <w:t xml:space="preserve">at that age</w:t>
+      </w:r>
+      <w:r>
+        <w:t xml:space="preserve">, so only the shape changes and the parameter count is</w:t>
+      </w:r>
+      <w:r>
+        <w:t xml:space="preserve"> </w:t>
+      </w:r>
+      <w:r>
+        <w:t xml:space="preserve">unchanged. Syntax is from the v3.30.22.1 manual, which specifies one</w:t>
+      </w:r>
+      <w:r>
+        <w:t xml:space="preserve"> </w:t>
+      </w:r>
+      <w:r>
+        <w:t xml:space="preserve">additional integer line for the reference age under option 2.</w:t>
+      </w:r>
+    </w:p>
+    <w:tbl>
+      <w:tblPr>
+        <w:tblStyle w:val="Table"/>
+        <w:tblW w:type="auto" w:w="0"/>
+        <w:tblLook w:firstRow="1" w:lastRow="0" w:firstColumn="0" w:lastColumn="0" w:noHBand="0" w:noVBand="0" w:val="0020"/>
+      </w:tblPr>
+      <w:tblGrid>
+        <w:gridCol w:w="2640"/>
+        <w:gridCol w:w="2640"/>
+        <w:gridCol w:w="2640"/>
+      </w:tblGrid>
+      <w:tr>
+        <w:trPr>
+          <w:tblHeader w:val="on"/>
+        </w:trPr>
+        <w:tc>
+          <w:tcPr/>
+          <w:p>
+            <w:pPr>
+              <w:pStyle w:val="Compact"/>
+            </w:pPr>
+          </w:p>
+        </w:tc>
+        <w:tc>
+          <w:tcPr/>
+          <w:p>
+            <w:pPr>
+              <w:pStyle w:val="Compact"/>
+            </w:pPr>
+            <w:r>
+              <w:t xml:space="preserve">A0</w:t>
+            </w:r>
+          </w:p>
+        </w:tc>
+        <w:tc>
+          <w:tcPr/>
+          <w:p>
+            <w:pPr>
+              <w:pStyle w:val="Compact"/>
+            </w:pPr>
+            <w:r>
+              <w:t xml:space="preserve">D4_lorenzenM</w:t>
+            </w:r>
+          </w:p>
+        </w:tc>
+      </w:tr>
+      <w:tr>
+        <w:tc>
+          <w:tcPr/>
+          <w:p>
+            <w:pPr>
+              <w:pStyle w:val="Compact"/>
+            </w:pPr>
+            <w:r>
+              <w:t xml:space="preserve">Estimated parameters</w:t>
+            </w:r>
+          </w:p>
+        </w:tc>
+        <w:tc>
+          <w:tcPr/>
+          <w:p>
+            <w:pPr>
+              <w:pStyle w:val="Compact"/>
+            </w:pPr>
+            <w:r>
+              <w:t xml:space="preserve">46</w:t>
+            </w:r>
+          </w:p>
+        </w:tc>
+        <w:tc>
+          <w:tcPr/>
+          <w:p>
+            <w:pPr>
+              <w:pStyle w:val="Compact"/>
+            </w:pPr>
+            <w:r>
+              <w:t xml:space="preserve">46</w:t>
+            </w:r>
+          </w:p>
+        </w:tc>
+      </w:tr>
+      <w:tr>
+        <w:tc>
+          <w:tcPr/>
+          <w:p>
+            <w:pPr>
+              <w:pStyle w:val="Compact"/>
+            </w:pPr>
+            <w:r>
+              <w:t xml:space="preserve">Total objective</w:t>
+            </w:r>
+          </w:p>
+        </w:tc>
+        <w:tc>
+          <w:tcPr/>
+          <w:p>
+            <w:pPr>
+              <w:pStyle w:val="Compact"/>
+            </w:pPr>
+            <w:r>
+              <w:t xml:space="preserve">1646.4</w:t>
+            </w:r>
+          </w:p>
+        </w:tc>
+        <w:tc>
+          <w:tcPr/>
+          <w:p>
+            <w:pPr>
+              <w:pStyle w:val="Compact"/>
+            </w:pPr>
+            <w:r>
+              <w:rPr>
+                <w:b/>
+                <w:bCs/>
+              </w:rPr>
+              <w:t xml:space="preserve">1567.8</w:t>
+            </w:r>
+          </w:p>
+        </w:tc>
+      </w:tr>
+      <w:tr>
+        <w:tc>
+          <w:tcPr/>
+          <w:p>
+            <w:pPr>
+              <w:pStyle w:val="Compact"/>
+            </w:pPr>
+            <w:r>
+              <w:t xml:space="preserve">Survey</w:t>
+            </w:r>
+          </w:p>
+        </w:tc>
+        <w:tc>
+          <w:tcPr/>
+          <w:p>
+            <w:pPr>
+              <w:pStyle w:val="Compact"/>
+            </w:pPr>
+            <w:r>
+              <w:t xml:space="preserve">922.5</w:t>
+            </w:r>
+          </w:p>
+        </w:tc>
+        <w:tc>
+          <w:tcPr/>
+          <w:p>
+            <w:pPr>
+              <w:pStyle w:val="Compact"/>
+            </w:pPr>
+            <w:r>
+              <w:rPr>
+                <w:b/>
+                <w:bCs/>
+              </w:rPr>
+              <w:t xml:space="preserve">877.6</w:t>
+            </w:r>
+          </w:p>
+        </w:tc>
+      </w:tr>
+      <w:tr>
+        <w:tc>
+          <w:tcPr/>
+          <w:p>
+            <w:pPr>
+              <w:pStyle w:val="Compact"/>
+            </w:pPr>
+            <w:r>
+              <w:t xml:space="preserve">Length composition</w:t>
+            </w:r>
+          </w:p>
+        </w:tc>
+        <w:tc>
+          <w:tcPr/>
+          <w:p>
+            <w:pPr>
+              <w:pStyle w:val="Compact"/>
+            </w:pPr>
+            <w:r>
+              <w:t xml:space="preserve">671.1</w:t>
+            </w:r>
+          </w:p>
+        </w:tc>
+        <w:tc>
+          <w:tcPr/>
+          <w:p>
+            <w:pPr>
+              <w:pStyle w:val="Compact"/>
+            </w:pPr>
+            <w:r>
+              <w:rPr>
+                <w:b/>
+                <w:bCs/>
+              </w:rPr>
+              <w:t xml:space="preserve">637.3</w:t>
+            </w:r>
+          </w:p>
+        </w:tc>
+      </w:tr>
+      <w:tr>
+        <w:tc>
+          <w:tcPr/>
+          <w:p>
+            <w:pPr>
+              <w:pStyle w:val="Compact"/>
+            </w:pPr>
+            <w:r>
+              <w:t xml:space="preserve">Unfished spawning output</w:t>
+            </w:r>
+          </w:p>
+        </w:tc>
+        <w:tc>
+          <w:tcPr/>
+          <w:p>
+            <w:pPr>
+              <w:pStyle w:val="Compact"/>
+            </w:pPr>
+            <w:r>
+              <w:t xml:space="preserve">39,194</w:t>
+            </w:r>
+          </w:p>
+        </w:tc>
+        <w:tc>
+          <w:tcPr/>
+          <w:p>
+            <w:pPr>
+              <w:pStyle w:val="Compact"/>
+            </w:pPr>
+            <w:r>
+              <w:t xml:space="preserve">40,286</w:t>
+            </w:r>
+          </w:p>
+        </w:tc>
+      </w:tr>
+      <w:tr>
+        <w:tc>
+          <w:tcPr/>
+          <w:p>
+            <w:pPr>
+              <w:pStyle w:val="Compact"/>
+            </w:pPr>
+            <w:r>
+              <w:t xml:space="preserve">Depletion 2023</w:t>
+            </w:r>
+          </w:p>
+        </w:tc>
+        <w:tc>
+          <w:tcPr/>
+          <w:p>
+            <w:pPr>
+              <w:pStyle w:val="Compact"/>
+            </w:pPr>
+            <w:r>
+              <w:t xml:space="preserve">0.086</w:t>
+            </w:r>
+          </w:p>
+        </w:tc>
+        <w:tc>
+          <w:tcPr/>
+          <w:p>
+            <w:pPr>
+              <w:pStyle w:val="Compact"/>
+            </w:pPr>
+            <w:r>
+              <w:t xml:space="preserve">0.097</w:t>
+            </w:r>
+          </w:p>
+        </w:tc>
+      </w:tr>
+    </w:tbl>
+    <w:p>
+      <w:pPr>
+        <w:pStyle w:val="BodyText"/>
+      </w:pPr>
+      <w:r>
+        <w:t xml:space="preserve">Resulting female M-at-age: 0.184 at age 0, 0.097 at age 10, 0.069 at age</w:t>
+      </w:r>
+      <w:r>
+        <w:t xml:space="preserve"> </w:t>
+      </w:r>
+      <w:r>
+        <w:t xml:space="preserve">30, 0.065 at the reference age 40, and 0.061 at age 70.</w:t>
       </w:r>
     </w:p>
     <w:p>
@@ -2433,29 +2802,129 @@
         <w:pStyle w:val="BodyText"/>
       </w:pPr>
       <w:r>
-        <w:t xml:space="preserve">That does not overturn the low-abundance conclusion, which is robust</w:t>
-      </w:r>
-      <w:r>
-        <w:t xml:space="preserve"> </w:t>
-      </w:r>
-      <w:r>
-        <w:t xml:space="preserve">across everything we have run. It does bear on the reconstructed unfished</w:t>
-      </w:r>
-      <w:r>
-        <w:t xml:space="preserve"> </w:t>
-      </w:r>
-      <w:r>
-        <w:t xml:space="preserve">scale and therefore on the removal advice, which is the separation you</w:t>
-      </w:r>
-      <w:r>
-        <w:t xml:space="preserve"> </w:t>
-      </w:r>
-      <w:r>
-        <w:t xml:space="preserve">drew in your fourth immediate priority.</w:t>
+        <w:t xml:space="preserve">At identical parameter count, Lorenzen fits better on both data</w:t>
+      </w:r>
+      <w:r>
+        <w:t xml:space="preserve"> </w:t>
+      </w:r>
+      <w:r>
+        <w:t xml:space="preserve">components by 78.6 units combined. There is no parsimony argument for</w:t>
+      </w:r>
+      <w:r>
+        <w:t xml:space="preserve"> </w:t>
+      </w:r>
+      <w:r>
+        <w:t xml:space="preserve">constant M here – it is simply the worse of the two.</w:t>
+      </w:r>
+    </w:p>
+    <w:p>
+      <w:pPr>
+        <w:pStyle w:val="BodyText"/>
+      </w:pPr>
+      <w:r>
+        <w:t xml:space="preserve">Per the agreed sequencing we are holding the phi0, S0 and</w:t>
+      </w:r>
+      <w:r>
+        <w:t xml:space="preserve"> </w:t>
+      </w:r>
+      <w:r>
+        <w:t xml:space="preserve">reference-point consequences until the baseline is validated against the</w:t>
+      </w:r>
+      <w:r>
+        <w:t xml:space="preserve"> </w:t>
+      </w:r>
+      <w:r>
+        <w:t xml:space="preserve">authors’ outputs, since those are absolute rather than relative</w:t>
+      </w:r>
+      <w:r>
+        <w:t xml:space="preserve"> </w:t>
+      </w:r>
+      <w:r>
+        <w:t xml:space="preserve">quantities. This configuration is still being multi-started, so the</w:t>
+      </w:r>
+      <w:r>
+        <w:t xml:space="preserve"> </w:t>
+      </w:r>
+      <w:r>
+        <w:t xml:space="preserve">numbers above are provisional.</w:t>
       </w:r>
     </w:p>
     <w:bookmarkEnd w:id="14"/>
-    <w:bookmarkStart w:id="15" w:name="still-open"/>
+    <w:bookmarkStart w:id="15" w:name="what-this-adds-up-to"/>
+    <w:p>
+      <w:pPr>
+        <w:pStyle w:val="Heading2"/>
+      </w:pPr>
+      <w:r>
+        <w:t xml:space="preserve">What this adds up to</w:t>
+      </w:r>
+    </w:p>
+    <w:p>
+      <w:pPr>
+        <w:pStyle w:val="FirstParagraph"/>
+      </w:pPr>
+      <w:r>
+        <w:t xml:space="preserve">A0’s depletion of about 0.09 is conditional on two structural</w:t>
+      </w:r>
+      <w:r>
+        <w:t xml:space="preserve"> </w:t>
+      </w:r>
+      <w:r>
+        <w:t xml:space="preserve">assumptions that the data do not obviously support. Allowing recruitment</w:t>
+      </w:r>
+      <w:r>
+        <w:t xml:space="preserve"> </w:t>
+      </w:r>
+      <w:r>
+        <w:t xml:space="preserve">variation moves it to 0.185. Your B-series counterparts, which relax</w:t>
+      </w:r>
+      <w:r>
+        <w:t xml:space="preserve"> </w:t>
+      </w:r>
+      <w:r>
+        <w:t xml:space="preserve">constant natural mortality instead, reach 0.172 and 0.179. Three</w:t>
+      </w:r>
+      <w:r>
+        <w:t xml:space="preserve"> </w:t>
+      </w:r>
+      <w:r>
+        <w:t xml:space="preserve">different relaxations of A0’s deterministic structure converge on</w:t>
+      </w:r>
+      <w:r>
+        <w:t xml:space="preserve"> </w:t>
+      </w:r>
+      <w:r>
+        <w:t xml:space="preserve">roughly twice the base depletion.</w:t>
+      </w:r>
+    </w:p>
+    <w:p>
+      <w:pPr>
+        <w:pStyle w:val="BodyText"/>
+      </w:pPr>
+      <w:r>
+        <w:t xml:space="preserve">That does not overturn the low-abundance conclusion, which is robust</w:t>
+      </w:r>
+      <w:r>
+        <w:t xml:space="preserve"> </w:t>
+      </w:r>
+      <w:r>
+        <w:t xml:space="preserve">across everything we have run. It does bear on the reconstructed unfished</w:t>
+      </w:r>
+      <w:r>
+        <w:t xml:space="preserve"> </w:t>
+      </w:r>
+      <w:r>
+        <w:t xml:space="preserve">scale and therefore on the removal advice, which is the separation you</w:t>
+      </w:r>
+      <w:r>
+        <w:t xml:space="preserve"> </w:t>
+      </w:r>
+      <w:r>
+        <w:t xml:space="preserve">drew in your fourth immediate priority.</w:t>
+      </w:r>
+    </w:p>
+    <w:bookmarkEnd w:id="15"/>
+    <w:bookmarkStart w:id="16" w:name="still-open"/>
     <w:p>
       <w:pPr>
         <w:pStyle w:val="Heading2"/>
@@ -2473,7 +2942,13 @@
         </w:numPr>
       </w:pPr>
       <w:r>
-        <w:t xml:space="preserve">Lorenzen M (S.10 row 3), build pending.</w:t>
+        <w:t xml:space="preserve">Old-age biology and trawl removals (rows 5, 7), deferred until the</w:t>
+      </w:r>
+      <w:r>
+        <w:t xml:space="preserve"> </w:t>
+      </w:r>
+      <w:r>
+        <w:t xml:space="preserve">baseline is validated against the authors’ outputs.</w:t>
       </w:r>
     </w:p>
     <w:p>
@@ -2485,35 +2960,17 @@
         </w:numPr>
       </w:pPr>
       <w:r>
-        <w:t xml:space="preserve">Old-age biology and trawl removals (rows 5, 7), deferred until the</w:t>
-      </w:r>
-      <w:r>
-        <w:t xml:space="preserve"> </w:t>
-      </w:r>
-      <w:r>
-        <w:t xml:space="preserve">baseline is validated against the authors’ outputs.</w:t>
+        <w:t xml:space="preserve">A0 verification proper (row 1), blocked on those outputs. See the</w:t>
+      </w:r>
+      <w:r>
+        <w:t xml:space="preserve"> </w:t>
+      </w:r>
+      <w:r>
+        <w:t xml:space="preserve">separate request.</w:t>
       </w:r>
     </w:p>
-    <w:p>
-      <w:pPr>
-        <w:pStyle w:val="Compact"/>
-        <w:numPr>
-          <w:ilvl w:val="0"/>
-          <w:numId w:val="1001"/>
-        </w:numPr>
-      </w:pPr>
-      <w:r>
-        <w:t xml:space="preserve">A0 verification proper (row 1), blocked on those outputs. See the</w:t>
-      </w:r>
-      <w:r>
-        <w:t xml:space="preserve"> </w:t>
-      </w:r>
-      <w:r>
-        <w:t xml:space="preserve">separate request.</w:t>
-      </w:r>
-    </w:p>
-    <w:bookmarkEnd w:id="15"/>
     <w:bookmarkEnd w:id="16"/>
+    <w:bookmarkEnd w:id="17"/>
     <w:sectPr>
       <w:footnotePr>
         <w:numRestart w:val="eachSect"/>

</xml_diff>

<commit_message>
D3b confirms the recruitment result against the window objection
Restricting deviations to 1970-2015 -- dropping the pre-1977 block the
data cannot inform, and the terminal years that cannot yet be observed --
uses 46 deviations instead of 63 and reaches 1520.2 against D3's 1513.8.
Depletion 0.175 against 0.185. Both windows put the deviation standard
deviation well above the assumed sigmaR of 0.4 (0.571 and 0.515).

The doubling of estimated depletion under recruitment variation does not
rest on unidentified deviations.

Co-Authored-By: Claude Opus 5 (1M context) <noreply@anthropic.com>
</commit_message>
<xml_diff>
--- a/review/diagnostics-memo.docx
+++ b/review/diagnostics-memo.docx
@@ -2420,13 +2420,363 @@
         <w:pStyle w:val="BodyText"/>
       </w:pPr>
       <w:r>
-        <w:t xml:space="preserve">A variant restricting the deviation window to 1970-2015, where the data</w:t>
-      </w:r>
-      <w:r>
-        <w:t xml:space="preserve"> </w:t>
-      </w:r>
-      <w:r>
-        <w:t xml:space="preserve">can actually inform it, is built and queued.</w:t>
+        <w:rPr>
+          <w:b/>
+          <w:bCs/>
+        </w:rPr>
+        <w:t xml:space="preserve">The result survives the obvious objection.</w:t>
+      </w:r>
+      <w:r>
+        <w:t xml:space="preserve"> </w:t>
+      </w:r>
+      <w:r>
+        <w:rPr>
+          <w:rStyle w:val="VerbatimChar"/>
+        </w:rPr>
+        <w:t xml:space="preserve">D3b_recdev_window</w:t>
+      </w:r>
+      <w:r>
+        <w:t xml:space="preserve"> </w:t>
+      </w:r>
+      <w:r>
+        <w:t xml:space="preserve">restricts the deviations to 1970-2015, dropping the unidentified</w:t>
+      </w:r>
+      <w:r>
+        <w:t xml:space="preserve"> </w:t>
+      </w:r>
+      <w:r>
+        <w:t xml:space="preserve">pre-1977 block and the terminal years that cannot yet be observed. It</w:t>
+      </w:r>
+      <w:r>
+        <w:t xml:space="preserve"> </w:t>
+      </w:r>
+      <w:r>
+        <w:t xml:space="preserve">uses 46 deviations instead of 63 and reaches a total of 1520.2 against</w:t>
+      </w:r>
+      <w:r>
+        <w:t xml:space="preserve"> </w:t>
+      </w:r>
+      <w:r>
+        <w:t xml:space="preserve">D3’s 1513.8 – essentially the same fit for 17 fewer parameters:</w:t>
+      </w:r>
+    </w:p>
+    <w:tbl>
+      <w:tblPr>
+        <w:tblStyle w:val="Table"/>
+        <w:tblW w:type="auto" w:w="0"/>
+        <w:tblLook w:firstRow="1" w:lastRow="0" w:firstColumn="0" w:lastColumn="0" w:noHBand="0" w:noVBand="0" w:val="0020"/>
+      </w:tblPr>
+      <w:tblGrid>
+        <w:gridCol w:w="1980"/>
+        <w:gridCol w:w="1980"/>
+        <w:gridCol w:w="1980"/>
+        <w:gridCol w:w="1980"/>
+      </w:tblGrid>
+      <w:tr>
+        <w:trPr>
+          <w:tblHeader w:val="on"/>
+        </w:trPr>
+        <w:tc>
+          <w:tcPr/>
+          <w:p>
+            <w:pPr>
+              <w:pStyle w:val="Compact"/>
+            </w:pPr>
+          </w:p>
+        </w:tc>
+        <w:tc>
+          <w:tcPr/>
+          <w:p>
+            <w:pPr>
+              <w:pStyle w:val="Compact"/>
+            </w:pPr>
+            <w:r>
+              <w:t xml:space="preserve">A0</w:t>
+            </w:r>
+          </w:p>
+        </w:tc>
+        <w:tc>
+          <w:tcPr/>
+          <w:p>
+            <w:pPr>
+              <w:pStyle w:val="Compact"/>
+            </w:pPr>
+            <w:r>
+              <w:t xml:space="preserve">D3 (1960-2022)</w:t>
+            </w:r>
+          </w:p>
+        </w:tc>
+        <w:tc>
+          <w:tcPr/>
+          <w:p>
+            <w:pPr>
+              <w:pStyle w:val="Compact"/>
+            </w:pPr>
+            <w:r>
+              <w:t xml:space="preserve">D3b (1970-2015)</w:t>
+            </w:r>
+          </w:p>
+        </w:tc>
+      </w:tr>
+      <w:tr>
+        <w:tc>
+          <w:tcPr/>
+          <w:p>
+            <w:pPr>
+              <w:pStyle w:val="Compact"/>
+            </w:pPr>
+            <w:r>
+              <w:t xml:space="preserve">Survey</w:t>
+            </w:r>
+          </w:p>
+        </w:tc>
+        <w:tc>
+          <w:tcPr/>
+          <w:p>
+            <w:pPr>
+              <w:pStyle w:val="Compact"/>
+            </w:pPr>
+            <w:r>
+              <w:t xml:space="preserve">922.5</w:t>
+            </w:r>
+          </w:p>
+        </w:tc>
+        <w:tc>
+          <w:tcPr/>
+          <w:p>
+            <w:pPr>
+              <w:pStyle w:val="Compact"/>
+            </w:pPr>
+            <w:r>
+              <w:t xml:space="preserve">768.3</w:t>
+            </w:r>
+          </w:p>
+        </w:tc>
+        <w:tc>
+          <w:tcPr/>
+          <w:p>
+            <w:pPr>
+              <w:pStyle w:val="Compact"/>
+            </w:pPr>
+            <w:r>
+              <w:t xml:space="preserve">772.5</w:t>
+            </w:r>
+          </w:p>
+        </w:tc>
+      </w:tr>
+      <w:tr>
+        <w:tc>
+          <w:tcPr/>
+          <w:p>
+            <w:pPr>
+              <w:pStyle w:val="Compact"/>
+            </w:pPr>
+            <w:r>
+              <w:t xml:space="preserve">Length composition</w:t>
+            </w:r>
+          </w:p>
+        </w:tc>
+        <w:tc>
+          <w:tcPr/>
+          <w:p>
+            <w:pPr>
+              <w:pStyle w:val="Compact"/>
+            </w:pPr>
+            <w:r>
+              <w:t xml:space="preserve">671.1</w:t>
+            </w:r>
+          </w:p>
+        </w:tc>
+        <w:tc>
+          <w:tcPr/>
+          <w:p>
+            <w:pPr>
+              <w:pStyle w:val="Compact"/>
+            </w:pPr>
+            <w:r>
+              <w:t xml:space="preserve">643.9</w:t>
+            </w:r>
+          </w:p>
+        </w:tc>
+        <w:tc>
+          <w:tcPr/>
+          <w:p>
+            <w:pPr>
+              <w:pStyle w:val="Compact"/>
+            </w:pPr>
+            <w:r>
+              <w:t xml:space="preserve">650.0</w:t>
+            </w:r>
+          </w:p>
+        </w:tc>
+      </w:tr>
+      <w:tr>
+        <w:tc>
+          <w:tcPr/>
+          <w:p>
+            <w:pPr>
+              <w:pStyle w:val="Compact"/>
+            </w:pPr>
+            <w:r>
+              <w:t xml:space="preserve">Recruitment penalty</w:t>
+            </w:r>
+          </w:p>
+        </w:tc>
+        <w:tc>
+          <w:tcPr/>
+          <w:p>
+            <w:pPr>
+              <w:pStyle w:val="Compact"/>
+            </w:pPr>
+            <w:r>
+              <w:t xml:space="preserve">0.0</w:t>
+            </w:r>
+          </w:p>
+        </w:tc>
+        <w:tc>
+          <w:tcPr/>
+          <w:p>
+            <w:pPr>
+              <w:pStyle w:val="Compact"/>
+            </w:pPr>
+            <w:r>
+              <w:t xml:space="preserve">51.3</w:t>
+            </w:r>
+          </w:p>
+        </w:tc>
+        <w:tc>
+          <w:tcPr/>
+          <w:p>
+            <w:pPr>
+              <w:pStyle w:val="Compact"/>
+            </w:pPr>
+            <w:r>
+              <w:t xml:space="preserve">45.9</w:t>
+            </w:r>
+          </w:p>
+        </w:tc>
+      </w:tr>
+      <w:tr>
+        <w:tc>
+          <w:tcPr/>
+          <w:p>
+            <w:pPr>
+              <w:pStyle w:val="Compact"/>
+            </w:pPr>
+            <w:r>
+              <w:t xml:space="preserve">Deviations estimated</w:t>
+            </w:r>
+          </w:p>
+        </w:tc>
+        <w:tc>
+          <w:tcPr/>
+          <w:p>
+            <w:pPr>
+              <w:pStyle w:val="Compact"/>
+            </w:pPr>
+            <w:r>
+              <w:t xml:space="preserve">0</w:t>
+            </w:r>
+          </w:p>
+        </w:tc>
+        <w:tc>
+          <w:tcPr/>
+          <w:p>
+            <w:pPr>
+              <w:pStyle w:val="Compact"/>
+            </w:pPr>
+            <w:r>
+              <w:t xml:space="preserve">63</w:t>
+            </w:r>
+          </w:p>
+        </w:tc>
+        <w:tc>
+          <w:tcPr/>
+          <w:p>
+            <w:pPr>
+              <w:pStyle w:val="Compact"/>
+            </w:pPr>
+            <w:r>
+              <w:t xml:space="preserve">46</w:t>
+            </w:r>
+          </w:p>
+        </w:tc>
+      </w:tr>
+      <w:tr>
+        <w:tc>
+          <w:tcPr/>
+          <w:p>
+            <w:pPr>
+              <w:pStyle w:val="Compact"/>
+            </w:pPr>
+            <w:r>
+              <w:t xml:space="preserve">Depletion 2023</w:t>
+            </w:r>
+          </w:p>
+        </w:tc>
+        <w:tc>
+          <w:tcPr/>
+          <w:p>
+            <w:pPr>
+              <w:pStyle w:val="Compact"/>
+            </w:pPr>
+            <w:r>
+              <w:t xml:space="preserve">0.086</w:t>
+            </w:r>
+          </w:p>
+        </w:tc>
+        <w:tc>
+          <w:tcPr/>
+          <w:p>
+            <w:pPr>
+              <w:pStyle w:val="Compact"/>
+            </w:pPr>
+            <w:r>
+              <w:t xml:space="preserve">0.185</w:t>
+            </w:r>
+          </w:p>
+        </w:tc>
+        <w:tc>
+          <w:tcPr/>
+          <w:p>
+            <w:pPr>
+              <w:pStyle w:val="Compact"/>
+            </w:pPr>
+            <w:r>
+              <w:rPr>
+                <w:b/>
+                <w:bCs/>
+              </w:rPr>
+              <w:t xml:space="preserve">0.175</w:t>
+            </w:r>
+          </w:p>
+        </w:tc>
+      </w:tr>
+    </w:tbl>
+    <w:p>
+      <w:pPr>
+        <w:pStyle w:val="BodyText"/>
+      </w:pPr>
+      <w:r>
+        <w:t xml:space="preserve">Both windows give a deviation standard deviation well above the assumed</w:t>
+      </w:r>
+      <w:r>
+        <w:t xml:space="preserve"> </w:t>
+      </w:r>
+      <w:r>
+        <w:t xml:space="preserve">sigmaR of 0.4 (0.515 and 0.571), and both roughly double estimated</w:t>
+      </w:r>
+      <w:r>
+        <w:t xml:space="preserve"> </w:t>
+      </w:r>
+      <w:r>
+        <w:t xml:space="preserve">depletion. The conclusion does not rest on the deviations that the data</w:t>
+      </w:r>
+      <w:r>
+        <w:t xml:space="preserve"> </w:t>
+      </w:r>
+      <w:r>
+        <w:t xml:space="preserve">cannot inform.</w:t>
       </w:r>
     </w:p>
     <w:bookmarkEnd w:id="13"/>

</xml_diff>